<commit_message>
Add career-readiness stack, software house directory, field recommendation, tech dictionary, and auth/UI polish
Brings in the accumulated Career Readiness feature set (Autopilot, Interview
Rehearsal, Application Pipeline, AI-Resilience, Assessment Generator) plus
new additions: a moderated software house directory (Pakistan + international,
student-submitted/admin-approved), a capability-matrix-driven field
recommendation with AI + deterministic fallback, a searchable tech-term
dictionary with a confusing-terms comparison section, password strength
policy with a live checklist, admin user deletion with cascade cleanup and
audit logging, and a redesigned Ask AI chat UI (markdown rendering, avatars,
auto-resizing input).

Co-Authored-By: Claude Sonnet 5 <noreply@anthropic.com>
</commit_message>
<xml_diff>
--- a/docs/03_Manual_Guide.docx
+++ b/docs/03_Manual_Guide.docx
@@ -2086,6 +2086,102 @@
                 <w:color w:val="111111"/>
                 <w:sz w:val="20"/>
               </w:rPr>
+              <w:t>Assessment Generator / Learning Path</w:t>
+            </w:r>
+          </w:p>
+        </w:tc>
+        <w:tc>
+          <w:tcPr>
+            <w:tcW w:type="dxa" w:w="4320"/>
+          </w:tcPr>
+          <w:p>
+            <w:r/>
+            <w:r>
+              <w:rPr>
+                <w:rFonts w:ascii="Consolas" w:hAnsi="Consolas"/>
+                <w:color w:val="333333"/>
+                <w:sz w:val="18"/>
+              </w:rPr>
+              <w:t>server/src/services/assessmentService.ts</w:t>
+            </w:r>
+            <w:r>
+              <w:rPr>
+                <w:rFonts w:ascii="Calibri" w:hAnsi="Calibri"/>
+                <w:b w:val="0"/>
+                <w:color w:val="111111"/>
+                <w:sz w:val="20"/>
+              </w:rPr>
+              <w:t xml:space="preserve"> (Autopilot's gap report is its input)</w:t>
+            </w:r>
+          </w:p>
+        </w:tc>
+      </w:tr>
+      <w:tr>
+        <w:tc>
+          <w:tcPr>
+            <w:tcW w:type="dxa" w:w="4320"/>
+          </w:tcPr>
+          <w:p>
+            <w:r/>
+            <w:r>
+              <w:rPr>
+                <w:rFonts w:ascii="Calibri" w:hAnsi="Calibri"/>
+                <w:b w:val="0"/>
+                <w:color w:val="111111"/>
+                <w:sz w:val="20"/>
+              </w:rPr>
+              <w:t>Interview Rehearsal / Application Pipeline</w:t>
+            </w:r>
+          </w:p>
+        </w:tc>
+        <w:tc>
+          <w:tcPr>
+            <w:tcW w:type="dxa" w:w="4320"/>
+          </w:tcPr>
+          <w:p>
+            <w:r/>
+            <w:r>
+              <w:rPr>
+                <w:rFonts w:ascii="Consolas" w:hAnsi="Consolas"/>
+                <w:color w:val="333333"/>
+                <w:sz w:val="18"/>
+              </w:rPr>
+              <w:t>server/src/services/interviewService.ts</w:t>
+            </w:r>
+            <w:r>
+              <w:rPr>
+                <w:rFonts w:ascii="Calibri" w:hAnsi="Calibri"/>
+                <w:b w:val="0"/>
+                <w:color w:val="111111"/>
+                <w:sz w:val="20"/>
+              </w:rPr>
+              <w:t xml:space="preserve">, </w:t>
+            </w:r>
+            <w:r>
+              <w:rPr>
+                <w:rFonts w:ascii="Consolas" w:hAnsi="Consolas"/>
+                <w:color w:val="333333"/>
+                <w:sz w:val="18"/>
+              </w:rPr>
+              <w:t>pipelineService.ts</w:t>
+            </w:r>
+          </w:p>
+        </w:tc>
+      </w:tr>
+      <w:tr>
+        <w:tc>
+          <w:tcPr>
+            <w:tcW w:type="dxa" w:w="4320"/>
+          </w:tcPr>
+          <w:p>
+            <w:r/>
+            <w:r>
+              <w:rPr>
+                <w:rFonts w:ascii="Calibri" w:hAnsi="Calibri"/>
+                <w:b w:val="0"/>
+                <w:color w:val="111111"/>
+                <w:sz w:val="20"/>
+              </w:rPr>
               <w:t>Scholarship Radar / Freelance</w:t>
             </w:r>
           </w:p>
@@ -2155,6 +2251,92 @@
                 <w:sz w:val="18"/>
               </w:rPr>
               <w:t>server/src/data/scholarships.ts</w:t>
+            </w:r>
+          </w:p>
+        </w:tc>
+      </w:tr>
+      <w:tr>
+        <w:tc>
+          <w:tcPr>
+            <w:tcW w:type="dxa" w:w="4320"/>
+          </w:tcPr>
+          <w:p>
+            <w:r/>
+            <w:r>
+              <w:rPr>
+                <w:rFonts w:ascii="Calibri" w:hAnsi="Calibri"/>
+                <w:b w:val="0"/>
+                <w:color w:val="111111"/>
+                <w:sz w:val="20"/>
+              </w:rPr>
+              <w:t>Curated fallback banks (skills, probes, interview questions, resources)</w:t>
+            </w:r>
+          </w:p>
+        </w:tc>
+        <w:tc>
+          <w:tcPr>
+            <w:tcW w:type="dxa" w:w="4320"/>
+          </w:tcPr>
+          <w:p>
+            <w:r/>
+            <w:r>
+              <w:rPr>
+                <w:rFonts w:ascii="Consolas" w:hAnsi="Consolas"/>
+                <w:color w:val="333333"/>
+                <w:sz w:val="18"/>
+              </w:rPr>
+              <w:t>server/src/data/skillTaxonomy.ts</w:t>
+            </w:r>
+            <w:r>
+              <w:rPr>
+                <w:rFonts w:ascii="Calibri" w:hAnsi="Calibri"/>
+                <w:b w:val="0"/>
+                <w:color w:val="111111"/>
+                <w:sz w:val="20"/>
+              </w:rPr>
+              <w:t xml:space="preserve">, </w:t>
+            </w:r>
+            <w:r>
+              <w:rPr>
+                <w:rFonts w:ascii="Consolas" w:hAnsi="Consolas"/>
+                <w:color w:val="333333"/>
+                <w:sz w:val="18"/>
+              </w:rPr>
+              <w:t>assessmentBank.ts</w:t>
+            </w:r>
+            <w:r>
+              <w:rPr>
+                <w:rFonts w:ascii="Calibri" w:hAnsi="Calibri"/>
+                <w:b w:val="0"/>
+                <w:color w:val="111111"/>
+                <w:sz w:val="20"/>
+              </w:rPr>
+              <w:t xml:space="preserve">, </w:t>
+            </w:r>
+            <w:r>
+              <w:rPr>
+                <w:rFonts w:ascii="Consolas" w:hAnsi="Consolas"/>
+                <w:color w:val="333333"/>
+                <w:sz w:val="18"/>
+              </w:rPr>
+              <w:t>interviewQuestions.ts</w:t>
+            </w:r>
+            <w:r>
+              <w:rPr>
+                <w:rFonts w:ascii="Calibri" w:hAnsi="Calibri"/>
+                <w:b w:val="0"/>
+                <w:color w:val="111111"/>
+                <w:sz w:val="20"/>
+              </w:rPr>
+              <w:t xml:space="preserve">, </w:t>
+            </w:r>
+            <w:r>
+              <w:rPr>
+                <w:rFonts w:ascii="Consolas" w:hAnsi="Consolas"/>
+                <w:color w:val="333333"/>
+                <w:sz w:val="18"/>
+              </w:rPr>
+              <w:t>learningResources.ts</w:t>
             </w:r>
           </w:p>
         </w:tc>
@@ -2493,7 +2675,25 @@
           <w:color w:val="111111"/>
           <w:sz w:val="22"/>
         </w:rPr>
-        <w:t xml:space="preserve">Define the JSON output schema in </w:t>
+        <w:t xml:space="preserve">Define the request schema </w:t>
+      </w:r>
+      <w:r>
+        <w:rPr>
+          <w:rFonts w:ascii="Calibri" w:hAnsi="Calibri"/>
+          <w:b/>
+          <w:color w:val="111111"/>
+          <w:sz w:val="22"/>
+        </w:rPr>
+        <w:t>and</w:t>
+      </w:r>
+      <w:r>
+        <w:rPr>
+          <w:rFonts w:ascii="Calibri" w:hAnsi="Calibri"/>
+          <w:b w:val="0"/>
+          <w:color w:val="111111"/>
+          <w:sz w:val="22"/>
+        </w:rPr>
+        <w:t xml:space="preserve"> the JSON output schema in </w:t>
       </w:r>
       <w:r>
         <w:rPr>
@@ -2555,7 +2755,46 @@
           <w:color w:val="111111"/>
           <w:sz w:val="22"/>
         </w:rPr>
-        <w:t>Add a fallback path (cached or canonical content) for timeout/schema failure.</w:t>
+        <w:t>Add a fallback path (cached or canonical content) for timeout/schema failure. When the</w:t>
+      </w:r>
+    </w:p>
+    <w:p>
+      <w:r>
+        <w:rPr>
+          <w:rFonts w:ascii="Calibri" w:hAnsi="Calibri"/>
+          <w:b w:val="0"/>
+          <w:color w:val="111111"/>
+          <w:sz w:val="22"/>
+        </w:rPr>
+        <w:t xml:space="preserve">feature needs a bank to degrade to, put it in </w:t>
+      </w:r>
+      <w:r>
+        <w:rPr>
+          <w:rFonts w:ascii="Consolas" w:hAnsi="Consolas"/>
+          <w:color w:val="333333"/>
+          <w:sz w:val="20"/>
+        </w:rPr>
+        <w:t>server/src/data/</w:t>
+      </w:r>
+      <w:r>
+        <w:rPr>
+          <w:rFonts w:ascii="Calibri" w:hAnsi="Calibri"/>
+          <w:b w:val="0"/>
+          <w:color w:val="111111"/>
+          <w:sz w:val="22"/>
+        </w:rPr>
+        <w:t xml:space="preserve"> — every career feature</w:t>
+      </w:r>
+    </w:p>
+    <w:p>
+      <w:r>
+        <w:rPr>
+          <w:rFonts w:ascii="Calibri" w:hAnsi="Calibri"/>
+          <w:b w:val="0"/>
+          <w:color w:val="111111"/>
+          <w:sz w:val="22"/>
+        </w:rPr>
+        <w:t>ships with one so it still answers with no API key at all.</w:t>
       </w:r>
     </w:p>
     <w:p>
@@ -2601,6 +2840,139 @@
           <w:sz w:val="22"/>
         </w:rPr>
         <w:t xml:space="preserve"> if the endpoint is user-triggered.</w:t>
+      </w:r>
+    </w:p>
+    <w:p>
+      <w:pPr>
+        <w:pStyle w:val="ListNumber"/>
+      </w:pPr>
+      <w:r>
+        <w:rPr>
+          <w:rFonts w:ascii="Calibri" w:hAnsi="Calibri"/>
+          <w:b w:val="0"/>
+          <w:color w:val="111111"/>
+          <w:sz w:val="22"/>
+        </w:rPr>
+        <w:t>Add tests: mocked Gemini client, plus an RBAC-matrix entry for the route.</w:t>
+      </w:r>
+    </w:p>
+    <w:p>
+      <w:pPr>
+        <w:pStyle w:val="ListNumber"/>
+      </w:pPr>
+      <w:r>
+        <w:rPr>
+          <w:rFonts w:ascii="Calibri" w:hAnsi="Calibri"/>
+          <w:b w:val="0"/>
+          <w:color w:val="111111"/>
+          <w:sz w:val="22"/>
+        </w:rPr>
+        <w:t>If the response carries a derived field (a duration, a total, a percentage), return it on</w:t>
+      </w:r>
+    </w:p>
+    <w:p>
+      <w:r>
+        <w:rPr>
+          <w:rFonts w:ascii="Calibri" w:hAnsi="Calibri"/>
+          <w:b/>
+          <w:color w:val="111111"/>
+          <w:sz w:val="22"/>
+        </w:rPr>
+        <w:t>every</w:t>
+      </w:r>
+      <w:r>
+        <w:rPr>
+          <w:rFonts w:ascii="Calibri" w:hAnsi="Calibri"/>
+          <w:b w:val="0"/>
+          <w:color w:val="111111"/>
+          <w:sz w:val="22"/>
+        </w:rPr>
+        <w:t xml:space="preserve"> handler that serves the resource — </w:t>
+      </w:r>
+      <w:r>
+        <w:rPr>
+          <w:rFonts w:ascii="Consolas" w:hAnsi="Consolas"/>
+          <w:color w:val="333333"/>
+          <w:sz w:val="20"/>
+        </w:rPr>
+        <w:t>POST</w:t>
+      </w:r>
+      <w:r>
+        <w:rPr>
+          <w:rFonts w:ascii="Calibri" w:hAnsi="Calibri"/>
+          <w:b w:val="0"/>
+          <w:color w:val="111111"/>
+          <w:sz w:val="22"/>
+        </w:rPr>
+        <w:t xml:space="preserve"> </w:t>
+      </w:r>
+      <w:r>
+        <w:rPr>
+          <w:rFonts w:ascii="Calibri" w:hAnsi="Calibri"/>
+          <w:i/>
+          <w:color w:val="111111"/>
+          <w:sz w:val="22"/>
+        </w:rPr>
+        <w:t>and</w:t>
+      </w:r>
+      <w:r>
+        <w:rPr>
+          <w:rFonts w:ascii="Calibri" w:hAnsi="Calibri"/>
+          <w:b w:val="0"/>
+          <w:color w:val="111111"/>
+          <w:sz w:val="22"/>
+        </w:rPr>
+        <w:t xml:space="preserve"> </w:t>
+      </w:r>
+      <w:r>
+        <w:rPr>
+          <w:rFonts w:ascii="Consolas" w:hAnsi="Consolas"/>
+          <w:color w:val="333333"/>
+          <w:sz w:val="20"/>
+        </w:rPr>
+        <w:t>GET</w:t>
+      </w:r>
+      <w:r>
+        <w:rPr>
+          <w:rFonts w:ascii="Calibri" w:hAnsi="Calibri"/>
+          <w:b w:val="0"/>
+          <w:color w:val="111111"/>
+          <w:sz w:val="22"/>
+        </w:rPr>
+        <w:t>. The client renders from</w:t>
+      </w:r>
+    </w:p>
+    <w:p>
+      <w:r>
+        <w:rPr>
+          <w:rFonts w:ascii="Calibri" w:hAnsi="Calibri"/>
+          <w:b w:val="0"/>
+          <w:color w:val="111111"/>
+          <w:sz w:val="22"/>
+        </w:rPr>
+        <w:t>whichever response it happens to hold, so a field missing from the reload path silently</w:t>
+      </w:r>
+    </w:p>
+    <w:p>
+      <w:r>
+        <w:rPr>
+          <w:rFonts w:ascii="Calibri" w:hAnsi="Calibri"/>
+          <w:b w:val="0"/>
+          <w:color w:val="111111"/>
+          <w:sz w:val="22"/>
+        </w:rPr>
+        <w:t>blanks the UI. Type-checking will not catch it, because the client mirrors APIs with its</w:t>
+      </w:r>
+    </w:p>
+    <w:p>
+      <w:r>
+        <w:rPr>
+          <w:rFonts w:ascii="Calibri" w:hAnsi="Calibri"/>
+          <w:b w:val="0"/>
+          <w:color w:val="111111"/>
+          <w:sz w:val="22"/>
+        </w:rPr>
+        <w:t>own local interfaces.</w:t>
       </w:r>
     </w:p>
     <w:p>
@@ -2852,6 +3224,41 @@
                 <w:color w:val="333333"/>
                 <w:sz w:val="18"/>
               </w:rPr>
+              <w:t>npm run seed:lessons</w:t>
+            </w:r>
+          </w:p>
+        </w:tc>
+        <w:tc>
+          <w:tcPr>
+            <w:tcW w:type="dxa" w:w="4320"/>
+          </w:tcPr>
+          <w:p>
+            <w:r/>
+            <w:r>
+              <w:rPr>
+                <w:rFonts w:ascii="Calibri" w:hAnsi="Calibri"/>
+                <w:b w:val="0"/>
+                <w:color w:val="111111"/>
+                <w:sz w:val="20"/>
+              </w:rPr>
+              <w:t>Load the curated lesson + exercise bank</w:t>
+            </w:r>
+          </w:p>
+        </w:tc>
+      </w:tr>
+      <w:tr>
+        <w:tc>
+          <w:tcPr>
+            <w:tcW w:type="dxa" w:w="4320"/>
+          </w:tcPr>
+          <w:p>
+            <w:r/>
+            <w:r>
+              <w:rPr>
+                <w:rFonts w:ascii="Consolas" w:hAnsi="Consolas"/>
+                <w:color w:val="333333"/>
+                <w:sz w:val="18"/>
+              </w:rPr>
               <w:t>npm test</w:t>
             </w:r>
           </w:p>
@@ -2869,7 +3276,41 @@
                 <w:color w:val="111111"/>
                 <w:sz w:val="20"/>
               </w:rPr>
-              <w:t>Run unit + integration tests (server)</w:t>
+              <w:t xml:space="preserve">Run the server suite — 112 Vitest + Supertest tests across </w:t>
+            </w:r>
+            <w:r>
+              <w:rPr>
+                <w:rFonts w:ascii="Consolas" w:hAnsi="Consolas"/>
+                <w:color w:val="333333"/>
+                <w:sz w:val="18"/>
+              </w:rPr>
+              <w:t>tests/rbac.test.ts</w:t>
+            </w:r>
+            <w:r>
+              <w:rPr>
+                <w:rFonts w:ascii="Calibri" w:hAnsi="Calibri"/>
+                <w:b w:val="0"/>
+                <w:color w:val="111111"/>
+                <w:sz w:val="20"/>
+              </w:rPr>
+              <w:t xml:space="preserve"> (72) and </w:t>
+            </w:r>
+            <w:r>
+              <w:rPr>
+                <w:rFonts w:ascii="Consolas" w:hAnsi="Consolas"/>
+                <w:color w:val="333333"/>
+                <w:sz w:val="18"/>
+              </w:rPr>
+              <w:t>tests/careerStack.test.ts</w:t>
+            </w:r>
+            <w:r>
+              <w:rPr>
+                <w:rFonts w:ascii="Calibri" w:hAnsi="Calibri"/>
+                <w:b w:val="0"/>
+                <w:color w:val="111111"/>
+                <w:sz w:val="20"/>
+              </w:rPr>
+              <w:t xml:space="preserve"> (40)</w:t>
             </w:r>
           </w:p>
         </w:tc>
@@ -2954,6 +3395,110 @@
       </w:tr>
     </w:tbl>
     <w:p/>
+    <w:p>
+      <w:r>
+        <w:rPr>
+          <w:rFonts w:ascii="Calibri" w:hAnsi="Calibri"/>
+          <w:b w:val="0"/>
+          <w:color w:val="111111"/>
+          <w:sz w:val="22"/>
+        </w:rPr>
+        <w:t>There is no root typecheck script. Run it per workspace:</w:t>
+      </w:r>
+    </w:p>
+    <w:p>
+      <w:pPr>
+        <w:ind w:left="432"/>
+      </w:pPr>
+      <w:r>
+        <w:rPr>
+          <w:rFonts w:ascii="Consolas" w:hAnsi="Consolas"/>
+          <w:color w:val="222222"/>
+          <w:sz w:val="19"/>
+        </w:rPr>
+        <w:t>cd server &amp;&amp; npx tsc --noEmit</w:t>
+        <w:br/>
+        <w:t>cd client &amp;&amp; npx tsc --noEmit</w:t>
+      </w:r>
+    </w:p>
+    <w:p>
+      <w:pPr>
+        <w:ind w:left="432"/>
+      </w:pPr>
+      <w:r>
+        <w:rPr>
+          <w:rFonts w:ascii="Calibri" w:hAnsi="Calibri"/>
+          <w:b w:val="0"/>
+          <w:i/>
+          <w:color w:val="555555"/>
+          <w:sz w:val="22"/>
+        </w:rPr>
+        <w:t xml:space="preserve">These are the only seven root scripts. </w:t>
+      </w:r>
+      <w:r>
+        <w:rPr>
+          <w:rFonts w:ascii="Consolas" w:hAnsi="Consolas"/>
+          <w:i/>
+          <w:color w:val="333333"/>
+          <w:sz w:val="20"/>
+        </w:rPr>
+        <w:t>npm run dev</w:t>
+      </w:r>
+      <w:r>
+        <w:rPr>
+          <w:rFonts w:ascii="Calibri" w:hAnsi="Calibri"/>
+          <w:b w:val="0"/>
+          <w:i/>
+          <w:color w:val="555555"/>
+          <w:sz w:val="22"/>
+        </w:rPr>
+        <w:t xml:space="preserve"> and </w:t>
+      </w:r>
+      <w:r>
+        <w:rPr>
+          <w:rFonts w:ascii="Consolas" w:hAnsi="Consolas"/>
+          <w:i/>
+          <w:color w:val="333333"/>
+          <w:sz w:val="20"/>
+        </w:rPr>
+        <w:t>npm run test:ai</w:t>
+      </w:r>
+      <w:r>
+        <w:rPr>
+          <w:rFonts w:ascii="Calibri" w:hAnsi="Calibri"/>
+          <w:b w:val="0"/>
+          <w:i/>
+          <w:color w:val="555555"/>
+          <w:sz w:val="22"/>
+        </w:rPr>
+        <w:t xml:space="preserve"> do </w:t>
+      </w:r>
+      <w:r>
+        <w:rPr>
+          <w:rFonts w:ascii="Calibri" w:hAnsi="Calibri"/>
+          <w:b/>
+          <w:i/>
+          <w:color w:val="555555"/>
+          <w:sz w:val="22"/>
+        </w:rPr>
+        <w:t>not</w:t>
+      </w:r>
+    </w:p>
+    <w:p>
+      <w:pPr>
+        <w:ind w:left="432"/>
+      </w:pPr>
+      <w:r>
+        <w:rPr>
+          <w:rFonts w:ascii="Calibri" w:hAnsi="Calibri"/>
+          <w:b w:val="0"/>
+          <w:i/>
+          <w:color w:val="555555"/>
+          <w:sz w:val="22"/>
+        </w:rPr>
+        <w:t>exist — older notes that mention them are stale.</w:t>
+      </w:r>
+    </w:p>
     <w:p>
       <w:pPr>
         <w:pStyle w:val="Heading1"/>
@@ -3173,6 +3718,50 @@
                 <w:sz w:val="20"/>
               </w:rPr>
               <w:t>Assert structured-output parsing and fallback on malformed responses</w:t>
+            </w:r>
+          </w:p>
+        </w:tc>
+      </w:tr>
+      <w:tr>
+        <w:tc>
+          <w:tcPr>
+            <w:tcW w:type="dxa" w:w="4320"/>
+          </w:tcPr>
+          <w:p>
+            <w:r/>
+            <w:r>
+              <w:rPr>
+                <w:rFonts w:ascii="Calibri" w:hAnsi="Calibri"/>
+                <w:b w:val="0"/>
+                <w:color w:val="111111"/>
+                <w:sz w:val="20"/>
+              </w:rPr>
+              <w:t>Career stack</w:t>
+            </w:r>
+          </w:p>
+        </w:tc>
+        <w:tc>
+          <w:tcPr>
+            <w:tcW w:type="dxa" w:w="4320"/>
+          </w:tcPr>
+          <w:p>
+            <w:r/>
+            <w:r>
+              <w:rPr>
+                <w:rFonts w:ascii="Consolas" w:hAnsi="Consolas"/>
+                <w:color w:val="333333"/>
+                <w:sz w:val="18"/>
+              </w:rPr>
+              <w:t>tests/careerStack.test.ts</w:t>
+            </w:r>
+            <w:r>
+              <w:rPr>
+                <w:rFonts w:ascii="Calibri" w:hAnsi="Calibri"/>
+                <w:b w:val="0"/>
+                <w:color w:val="111111"/>
+                <w:sz w:val="20"/>
+              </w:rPr>
+              <w:t xml:space="preserve"> (40 tests) pins the deterministic maths across eight groups: skill match and fit percentage, gap analysis, recruiter lens, automated assessment generator, customized learning path, interview rehearsal studio, application pipeline, and hydrating a stored gap report (so Autopilot plans saved before these fields existed still load)</w:t>
             </w:r>
           </w:p>
         </w:tc>
@@ -4036,7 +4625,7 @@
                 <w:color w:val="111111"/>
                 <w:sz w:val="20"/>
               </w:rPr>
-              <w:t>429 on login/register/chat/autopilot/dojo/freelance</w:t>
+              <w:t>429 on a user-triggered route</w:t>
             </w:r>
           </w:p>
         </w:tc>
@@ -4053,7 +4642,93 @@
                 <w:color w:val="111111"/>
                 <w:sz w:val="20"/>
               </w:rPr>
-              <w:t>Rate limiter tripped</w:t>
+              <w:t xml:space="preserve">Rate limiter tripped. Budgets: global 300/15min, login 10/15min, register 20/hr, </w:t>
+            </w:r>
+            <w:r>
+              <w:rPr>
+                <w:rFonts w:ascii="Consolas" w:hAnsi="Consolas"/>
+                <w:color w:val="333333"/>
+                <w:sz w:val="18"/>
+              </w:rPr>
+              <w:t>/premium/autopilot</w:t>
+            </w:r>
+            <w:r>
+              <w:rPr>
+                <w:rFonts w:ascii="Calibri" w:hAnsi="Calibri"/>
+                <w:b w:val="0"/>
+                <w:color w:val="111111"/>
+                <w:sz w:val="20"/>
+              </w:rPr>
+              <w:t xml:space="preserve"> 20/15min (</w:t>
+            </w:r>
+            <w:r>
+              <w:rPr>
+                <w:rFonts w:ascii="Calibri" w:hAnsi="Calibri"/>
+                <w:b/>
+                <w:color w:val="111111"/>
+                <w:sz w:val="20"/>
+              </w:rPr>
+              <w:t>prefix-matched</w:t>
+            </w:r>
+            <w:r>
+              <w:rPr>
+                <w:rFonts w:ascii="Calibri" w:hAnsi="Calibri"/>
+                <w:b w:val="0"/>
+                <w:color w:val="111111"/>
+                <w:sz w:val="20"/>
+              </w:rPr>
+              <w:t xml:space="preserve">, so it also covers the assessment route and every page-load read), assessment 8/15min, </w:t>
+            </w:r>
+            <w:r>
+              <w:rPr>
+                <w:rFonts w:ascii="Consolas" w:hAnsi="Consolas"/>
+                <w:color w:val="333333"/>
+                <w:sz w:val="18"/>
+              </w:rPr>
+              <w:t>/interview/script</w:t>
+            </w:r>
+            <w:r>
+              <w:rPr>
+                <w:rFonts w:ascii="Calibri" w:hAnsi="Calibri"/>
+                <w:b w:val="0"/>
+                <w:color w:val="111111"/>
+                <w:sz w:val="20"/>
+              </w:rPr>
+              <w:t xml:space="preserve"> 8/15min, </w:t>
+            </w:r>
+            <w:r>
+              <w:rPr>
+                <w:rFonts w:ascii="Consolas" w:hAnsi="Consolas"/>
+                <w:color w:val="333333"/>
+                <w:sz w:val="18"/>
+              </w:rPr>
+              <w:t>/dojo/critique</w:t>
+            </w:r>
+            <w:r>
+              <w:rPr>
+                <w:rFonts w:ascii="Calibri" w:hAnsi="Calibri"/>
+                <w:b w:val="0"/>
+                <w:color w:val="111111"/>
+                <w:sz w:val="20"/>
+              </w:rPr>
+              <w:t xml:space="preserve"> 10/15min, </w:t>
+            </w:r>
+            <w:r>
+              <w:rPr>
+                <w:rFonts w:ascii="Consolas" w:hAnsi="Consolas"/>
+                <w:color w:val="333333"/>
+                <w:sz w:val="18"/>
+              </w:rPr>
+              <w:t>/freelance/generate</w:t>
+            </w:r>
+            <w:r>
+              <w:rPr>
+                <w:rFonts w:ascii="Calibri" w:hAnsi="Calibri"/>
+                <w:b w:val="0"/>
+                <w:color w:val="111111"/>
+                <w:sz w:val="20"/>
+              </w:rPr>
+              <w:t xml:space="preserve"> 10/15min, chat 60/15min</w:t>
             </w:r>
           </w:p>
         </w:tc>
@@ -4079,6 +4754,300 @@
                 <w:sz w:val="18"/>
               </w:rPr>
               <w:t>src/config/security.ts</w:t>
+            </w:r>
+            <w:r>
+              <w:rPr>
+                <w:rFonts w:ascii="Calibri" w:hAnsi="Calibri"/>
+                <w:b w:val="0"/>
+                <w:color w:val="111111"/>
+                <w:sz w:val="20"/>
+              </w:rPr>
+              <w:t xml:space="preserve"> — </w:t>
+            </w:r>
+            <w:r>
+              <w:rPr>
+                <w:rFonts w:ascii="Calibri" w:hAnsi="Calibri"/>
+                <w:b/>
+                <w:color w:val="111111"/>
+                <w:sz w:val="20"/>
+              </w:rPr>
+              <w:t>except</w:t>
+            </w:r>
+            <w:r>
+              <w:rPr>
+                <w:rFonts w:ascii="Calibri" w:hAnsi="Calibri"/>
+                <w:b w:val="0"/>
+                <w:color w:val="111111"/>
+                <w:sz w:val="20"/>
+              </w:rPr>
+              <w:t xml:space="preserve"> the chat limiter, which is declared locally in </w:t>
+            </w:r>
+            <w:r>
+              <w:rPr>
+                <w:rFonts w:ascii="Consolas" w:hAnsi="Consolas"/>
+                <w:color w:val="333333"/>
+                <w:sz w:val="18"/>
+              </w:rPr>
+              <w:t>routes/chatRoutes.ts</w:t>
+            </w:r>
+            <w:r>
+              <w:rPr>
+                <w:rFonts w:ascii="Calibri" w:hAnsi="Calibri"/>
+                <w:b w:val="0"/>
+                <w:color w:val="111111"/>
+                <w:sz w:val="20"/>
+              </w:rPr>
+              <w:t xml:space="preserve">. All limiters are disabled when </w:t>
+            </w:r>
+            <w:r>
+              <w:rPr>
+                <w:rFonts w:ascii="Consolas" w:hAnsi="Consolas"/>
+                <w:color w:val="333333"/>
+                <w:sz w:val="18"/>
+              </w:rPr>
+              <w:t>NODE_ENV === "test"</w:t>
+            </w:r>
+          </w:p>
+        </w:tc>
+      </w:tr>
+      <w:tr>
+        <w:tc>
+          <w:tcPr>
+            <w:tcW w:type="dxa" w:w="2880"/>
+          </w:tcPr>
+          <w:p>
+            <w:r/>
+            <w:r>
+              <w:rPr>
+                <w:rFonts w:ascii="Calibri" w:hAnsi="Calibri"/>
+                <w:b w:val="0"/>
+                <w:color w:val="111111"/>
+                <w:sz w:val="20"/>
+              </w:rPr>
+              <w:t>409 when saving an application</w:t>
+            </w:r>
+          </w:p>
+        </w:tc>
+        <w:tc>
+          <w:tcPr>
+            <w:tcW w:type="dxa" w:w="2880"/>
+          </w:tcPr>
+          <w:p>
+            <w:r/>
+            <w:r>
+              <w:rPr>
+                <w:rFonts w:ascii="Consolas" w:hAnsi="Consolas"/>
+                <w:color w:val="333333"/>
+                <w:sz w:val="18"/>
+              </w:rPr>
+              <w:t>{ userId, company, role }</w:t>
+            </w:r>
+            <w:r>
+              <w:rPr>
+                <w:rFonts w:ascii="Calibri" w:hAnsi="Calibri"/>
+                <w:b w:val="0"/>
+                <w:color w:val="111111"/>
+                <w:sz w:val="20"/>
+              </w:rPr>
+              <w:t xml:space="preserve"> carries a unique index</w:t>
+            </w:r>
+          </w:p>
+        </w:tc>
+        <w:tc>
+          <w:tcPr>
+            <w:tcW w:type="dxa" w:w="2880"/>
+          </w:tcPr>
+          <w:p>
+            <w:r/>
+            <w:r>
+              <w:rPr>
+                <w:rFonts w:ascii="Calibri" w:hAnsi="Calibri"/>
+                <w:b w:val="0"/>
+                <w:color w:val="111111"/>
+                <w:sz w:val="20"/>
+              </w:rPr>
+              <w:t>Edit the existing row instead of adding a second one; the constraint is what stops the pipeline filling with duplicates</w:t>
+            </w:r>
+          </w:p>
+        </w:tc>
+      </w:tr>
+      <w:tr>
+        <w:tc>
+          <w:tcPr>
+            <w:tcW w:type="dxa" w:w="2880"/>
+          </w:tcPr>
+          <w:p>
+            <w:r/>
+            <w:r>
+              <w:rPr>
+                <w:rFonts w:ascii="Calibri" w:hAnsi="Calibri"/>
+                <w:b w:val="0"/>
+                <w:color w:val="111111"/>
+                <w:sz w:val="20"/>
+              </w:rPr>
+              <w:t>Embedded-MongoDB boot dies after ~8s with a lock error</w:t>
+            </w:r>
+          </w:p>
+        </w:tc>
+        <w:tc>
+          <w:tcPr>
+            <w:tcW w:type="dxa" w:w="2880"/>
+          </w:tcPr>
+          <w:p>
+            <w:r/>
+            <w:r>
+              <w:rPr>
+                <w:rFonts w:ascii="Consolas" w:hAnsi="Consolas"/>
+                <w:color w:val="333333"/>
+                <w:sz w:val="18"/>
+              </w:rPr>
+              <w:t>server/mongo-data/mongod.lock</w:t>
+            </w:r>
+            <w:r>
+              <w:rPr>
+                <w:rFonts w:ascii="Calibri" w:hAnsi="Calibri"/>
+                <w:b w:val="0"/>
+                <w:color w:val="111111"/>
+                <w:sz w:val="20"/>
+              </w:rPr>
+              <w:t xml:space="preserve"> names a PID that no longer exists but cannot be probed (</w:t>
+            </w:r>
+            <w:r>
+              <w:rPr>
+                <w:rFonts w:ascii="Consolas" w:hAnsi="Consolas"/>
+                <w:color w:val="333333"/>
+                <w:sz w:val="18"/>
+              </w:rPr>
+              <w:t>EPERM</w:t>
+            </w:r>
+            <w:r>
+              <w:rPr>
+                <w:rFonts w:ascii="Calibri" w:hAnsi="Calibri"/>
+                <w:b w:val="0"/>
+                <w:color w:val="111111"/>
+                <w:sz w:val="20"/>
+              </w:rPr>
+              <w:t xml:space="preserve">), and </w:t>
+            </w:r>
+            <w:r>
+              <w:rPr>
+                <w:rFonts w:ascii="Consolas" w:hAnsi="Consolas"/>
+                <w:color w:val="333333"/>
+                <w:sz w:val="18"/>
+              </w:rPr>
+              <w:t>isPidAlive()</w:t>
+            </w:r>
+            <w:r>
+              <w:rPr>
+                <w:rFonts w:ascii="Calibri" w:hAnsi="Calibri"/>
+                <w:b w:val="0"/>
+                <w:color w:val="111111"/>
+                <w:sz w:val="20"/>
+              </w:rPr>
+              <w:t xml:space="preserve"> treats </w:t>
+            </w:r>
+            <w:r>
+              <w:rPr>
+                <w:rFonts w:ascii="Consolas" w:hAnsi="Consolas"/>
+                <w:color w:val="333333"/>
+                <w:sz w:val="18"/>
+              </w:rPr>
+              <w:t>EPERM</w:t>
+            </w:r>
+            <w:r>
+              <w:rPr>
+                <w:rFonts w:ascii="Calibri" w:hAnsi="Calibri"/>
+                <w:b w:val="0"/>
+                <w:color w:val="111111"/>
+                <w:sz w:val="20"/>
+              </w:rPr>
+              <w:t xml:space="preserve"> as </w:t>
+            </w:r>
+            <w:r>
+              <w:rPr>
+                <w:rFonts w:ascii="Calibri" w:hAnsi="Calibri"/>
+                <w:i/>
+                <w:color w:val="111111"/>
+                <w:sz w:val="20"/>
+              </w:rPr>
+              <w:t>alive</w:t>
+            </w:r>
+            <w:r>
+              <w:rPr>
+                <w:rFonts w:ascii="Calibri" w:hAnsi="Calibri"/>
+                <w:b w:val="0"/>
+                <w:color w:val="111111"/>
+                <w:sz w:val="20"/>
+              </w:rPr>
+              <w:t xml:space="preserve">, so </w:t>
+            </w:r>
+            <w:r>
+              <w:rPr>
+                <w:rFonts w:ascii="Consolas" w:hAnsi="Consolas"/>
+                <w:color w:val="333333"/>
+                <w:sz w:val="18"/>
+              </w:rPr>
+              <w:t>clearStaleLock</w:t>
+            </w:r>
+            <w:r>
+              <w:rPr>
+                <w:rFonts w:ascii="Calibri" w:hAnsi="Calibri"/>
+                <w:b w:val="0"/>
+                <w:color w:val="111111"/>
+                <w:sz w:val="20"/>
+              </w:rPr>
+              <w:t xml:space="preserve"> never clears it</w:t>
+            </w:r>
+          </w:p>
+        </w:tc>
+        <w:tc>
+          <w:tcPr>
+            <w:tcW w:type="dxa" w:w="2880"/>
+          </w:tcPr>
+          <w:p>
+            <w:r/>
+            <w:r>
+              <w:rPr>
+                <w:rFonts w:ascii="Calibri" w:hAnsi="Calibri"/>
+                <w:b w:val="0"/>
+                <w:color w:val="111111"/>
+                <w:sz w:val="20"/>
+              </w:rPr>
+              <w:t xml:space="preserve">Point </w:t>
+            </w:r>
+            <w:r>
+              <w:rPr>
+                <w:rFonts w:ascii="Consolas" w:hAnsi="Consolas"/>
+                <w:color w:val="333333"/>
+                <w:sz w:val="18"/>
+              </w:rPr>
+              <w:t>EMBEDDED_DB_PATH</w:t>
+            </w:r>
+            <w:r>
+              <w:rPr>
+                <w:rFonts w:ascii="Calibri" w:hAnsi="Calibri"/>
+                <w:b w:val="0"/>
+                <w:color w:val="111111"/>
+                <w:sz w:val="20"/>
+              </w:rPr>
+              <w:t xml:space="preserve"> at a fresh directory, or set a real </w:t>
+            </w:r>
+            <w:r>
+              <w:rPr>
+                <w:rFonts w:ascii="Consolas" w:hAnsi="Consolas"/>
+                <w:color w:val="333333"/>
+                <w:sz w:val="18"/>
+              </w:rPr>
+              <w:t>MONGO_URI</w:t>
+            </w:r>
+            <w:r>
+              <w:rPr>
+                <w:rFonts w:ascii="Calibri" w:hAnsi="Calibri"/>
+                <w:b w:val="0"/>
+                <w:color w:val="111111"/>
+                <w:sz w:val="20"/>
+              </w:rPr>
+              <w:t xml:space="preserve"> and skip the embedded path entirely. Do not delete the lock file by hand</w:t>
             </w:r>
           </w:p>
         </w:tc>

</xml_diff>